<commit_message>
Protege POST /api/biostar/events con clave compartida (X-Biostar-Key)
El endpoint no tenia ningun tipo de autenticacion: cualquiera que
llegara a la URL podia disparar el registro de fichadas sin pasar por
login. Como lo llama un totem fisico (no puede hacer login
usuario/contraseña como el resto de la API), se protege con una clave
fija comparada en tiempo constante via el header X-Biostar-Key en vez
de JWT, siguiendo el mismo patron que ScriptRunnerKey/DbScriptsController.

Se agrega BiostarSyncKey a appSettings.secrets.config.example y se
actualiza el manual de Biostar con la nueva forma de autenticarse.
</commit_message>
<xml_diff>
--- a/documentos/MANUAL_API_BIOSTAR.docx
+++ b/documentos/MANUAL_API_BIOSTAR.docx
@@ -18,7 +18,7 @@
         <w:t>Versión:</w:t>
       </w:r>
       <w:r>
-        <w:t xml:space="preserve"> 1.0</w:t>
+        <w:t xml:space="preserve"> 1.1</w:t>
       </w:r>
     </w:p>
     <w:p>
@@ -32,7 +32,14 @@
         <w:t xml:space="preserve"> Solo endpoints relacionados con la integración Biostar (control de acceso / fichadas).</w:t>
       </w:r>
     </w:p>
-    <w:p/>
+    <w:p>
+      <w:pPr>
+        <w:spacing w:before="80" w:after="80"/>
+        <w:pBdr>
+          <w:bottom w:val="single" w:sz="6" w:space="1" w:color="AAAAAA"/>
+        </w:pBdr>
+      </w:pPr>
+    </w:p>
     <w:p>
       <w:pPr>
         <w:pStyle w:val="Heading2"/>
@@ -67,6 +74,7 @@
       <w:r>
         <w:rPr>
           <w:rFonts w:ascii="Consolas" w:hAnsi="Consolas"/>
+          <w:color w:val="C7254E"/>
           <w:sz w:val="19"/>
         </w:rPr>
         <w:t>sl_fichada</w:t>
@@ -101,27 +109,32 @@
       <w:r>
         <w:rPr>
           <w:rFonts w:ascii="Consolas" w:hAnsi="Consolas"/>
+          <w:color w:val="C7254E"/>
           <w:sz w:val="19"/>
         </w:rPr>
         <w:t>POST /api/biostar/events</w:t>
       </w:r>
       <w:r>
-        <w:t xml:space="preserve"> — la</w:t>
+        <w:t xml:space="preserve"> —</w:t>
       </w:r>
     </w:p>
     <w:p>
       <w:r>
-        <w:t>API le pregunta a Biostar por el último evento y, si hay uno nuevo, crea la</w:t>
+        <w:t xml:space="preserve">lo llama el </w:t>
+      </w:r>
+      <w:r>
+        <w:rPr>
+          <w:b/>
+        </w:rPr>
+        <w:t>tótem físico</w:t>
+      </w:r>
+      <w:r>
+        <w:t xml:space="preserve"> para que la API le pregunte a Biostar por el</w:t>
       </w:r>
     </w:p>
     <w:p>
       <w:r>
-        <w:t>fichada. Pensado para llamarse desde un proceso periódico (polling), no</w:t>
-      </w:r>
-    </w:p>
-    <w:p>
-      <w:r>
-        <w:t>desde el usuario final.</w:t>
+        <w:t>último evento y, si hay uno nuevo, cree la fichada.</w:t>
       </w:r>
     </w:p>
     <w:p>
@@ -140,6 +153,7 @@
       <w:r>
         <w:rPr>
           <w:rFonts w:ascii="Consolas" w:hAnsi="Consolas"/>
+          <w:color w:val="C7254E"/>
           <w:sz w:val="19"/>
         </w:rPr>
         <w:t>api/fichada/*</w:t>
@@ -153,86 +167,76 @@
         <w:t>historial desde el front o generar reportes.</w:t>
       </w:r>
     </w:p>
-    <w:p/>
+    <w:p>
+      <w:pPr>
+        <w:spacing w:before="80" w:after="80"/>
+        <w:pBdr>
+          <w:bottom w:val="single" w:sz="6" w:space="1" w:color="AAAAAA"/>
+        </w:pBdr>
+      </w:pPr>
+    </w:p>
     <w:p>
       <w:pPr>
         <w:pStyle w:val="Heading2"/>
       </w:pPr>
       <w:r>
-        <w:t>2. ⚠️ Nota de seguridad importante</w:t>
+        <w:t xml:space="preserve">2. Autenticación de </w:t>
+      </w:r>
+      <w:r>
+        <w:rPr>
+          <w:rFonts w:ascii="Consolas" w:hAnsi="Consolas"/>
+          <w:color w:val="C7254E"/>
+          <w:sz w:val="19"/>
+        </w:rPr>
+        <w:t>POST /api/biostar/events</w:t>
       </w:r>
     </w:p>
     <w:p>
       <w:r>
+        <w:t>El tótem no se loguea como un usuario normal (no tiene usuario/contraseña</w:t>
+      </w:r>
+    </w:p>
+    <w:p>
+      <w:r>
+        <w:t>propios), así que este endpoint puntual no usa JWT como el resto de la API —</w:t>
+      </w:r>
+    </w:p>
+    <w:p>
+      <w:r>
+        <w:t xml:space="preserve">se protege con una </w:t>
+      </w:r>
+      <w:r>
+        <w:rPr>
+          <w:b/>
+        </w:rPr>
+        <w:t>clave fija compartida</w:t>
+      </w:r>
+      <w:r>
+        <w:t>, mandada en un header:</w:t>
+      </w:r>
+    </w:p>
+    <w:p>
+      <w:pPr>
+        <w:ind w:left="360"/>
+      </w:pPr>
+      <w:r>
         <w:rPr>
           <w:rFonts w:ascii="Consolas" w:hAnsi="Consolas"/>
+          <w:color w:val="333333"/>
           <w:sz w:val="19"/>
         </w:rPr>
         <w:t>POST /api/biostar/events</w:t>
       </w:r>
       <w:r>
-        <w:t xml:space="preserve"> </w:t>
-      </w:r>
-      <w:r>
-        <w:rPr>
-          <w:b/>
-        </w:rPr>
-        <w:t>no requiere token</w:t>
-      </w:r>
-      <w:r>
-        <w:t xml:space="preserve"> (no tiene </w:t>
+        <w:br/>
       </w:r>
       <w:r>
         <w:rPr>
           <w:rFonts w:ascii="Consolas" w:hAnsi="Consolas"/>
+          <w:color w:val="333333"/>
           <w:sz w:val="19"/>
         </w:rPr>
-        <w:t>[Authorize]</w:t>
-      </w:r>
-      <w:r>
-        <w:t xml:space="preserve"> ni</w:t>
-      </w:r>
-    </w:p>
-    <w:p>
-      <w:r>
-        <w:rPr>
-          <w:rFonts w:ascii="Consolas" w:hAnsi="Consolas"/>
-          <w:sz w:val="19"/>
-        </w:rPr>
-        <w:t>[AllowAnonymous]</w:t>
-      </w:r>
-      <w:r>
-        <w:t xml:space="preserve"> explícito — directamente no pide nada). Esto es distinto al</w:t>
-      </w:r>
-    </w:p>
-    <w:p>
-      <w:r>
-        <w:t>resto de la API, donde todo pide JWT salvo que esté marcado a propósito como</w:t>
-      </w:r>
-    </w:p>
-    <w:p>
-      <w:r>
-        <w:t>público (como los endpoints de tótem).</w:t>
-      </w:r>
-    </w:p>
-    <w:p>
-      <w:r>
-        <w:t>Cualquiera que pueda llegar a esa URL puede disparar una consulta a Biostar y,</w:t>
-      </w:r>
-    </w:p>
-    <w:p>
-      <w:r>
-        <w:t>si hay un evento nuevo, crear un usuario y una fichada. Si este endpoint está</w:t>
-      </w:r>
-    </w:p>
-    <w:p>
-      <w:r>
-        <w:t>expuesto a internet (no solo a la red interna donde corre el proceso que lo</w:t>
-      </w:r>
-    </w:p>
-    <w:p>
-      <w:r>
-        <w:t>llama), conviene:</w:t>
+        <w:t>X-Biostar-Key: {clave configurada en BiostarSyncKey}</w:t>
       </w:r>
     </w:p>
     <w:p>
@@ -240,7 +244,12 @@
         <w:pStyle w:val="ListBullet"/>
       </w:pPr>
       <w:r>
-        <w:t>Restringirlo por IP/firewall a la máquina que hace el polling, o</w:t>
+        <w:t>La clave se compara en tiempo constante (no filtra por timing en cuánto</w:t>
+      </w:r>
+    </w:p>
+    <w:p>
+      <w:r>
+        <w:t>tarda en responder si es correcta o no).</w:t>
       </w:r>
     </w:p>
     <w:p>
@@ -248,7 +257,37 @@
         <w:pStyle w:val="ListBullet"/>
       </w:pPr>
       <w:r>
-        <w:t>Agregarle autenticación (por ejemplo un rol de servicio dedicado), o</w:t>
+        <w:t xml:space="preserve">Si falta el header, la clave no coincide, o </w:t>
+      </w:r>
+      <w:r>
+        <w:rPr>
+          <w:rFonts w:ascii="Consolas" w:hAnsi="Consolas"/>
+          <w:color w:val="C7254E"/>
+          <w:sz w:val="19"/>
+        </w:rPr>
+        <w:t>BiostarSyncKey</w:t>
+      </w:r>
+      <w:r>
+        <w:t xml:space="preserve"> no está</w:t>
+      </w:r>
+    </w:p>
+    <w:p>
+      <w:r>
+        <w:t xml:space="preserve">configurado en el servidor: </w:t>
+      </w:r>
+      <w:r>
+        <w:rPr>
+          <w:b/>
+        </w:rPr>
+        <w:t>401 Unauthorized</w:t>
+      </w:r>
+      <w:r>
+        <w:t>, sin llegar a consultar</w:t>
+      </w:r>
+    </w:p>
+    <w:p>
+      <w:r>
+        <w:t>Biostar ni tocar la base de datos.</w:t>
       </w:r>
     </w:p>
     <w:p>
@@ -256,7 +295,23 @@
         <w:pStyle w:val="ListBullet"/>
       </w:pPr>
       <w:r>
-        <w:t>Confirmar que solo es alcanzable desde la red interna.</w:t>
+        <w:t xml:space="preserve">Guardar </w:t>
+      </w:r>
+      <w:r>
+        <w:rPr>
+          <w:rFonts w:ascii="Consolas" w:hAnsi="Consolas"/>
+          <w:color w:val="C7254E"/>
+          <w:sz w:val="19"/>
+        </w:rPr>
+        <w:t>BiostarSyncKey</w:t>
+      </w:r>
+      <w:r>
+        <w:t xml:space="preserve"> en la configuración del tótem junto con la URL de</w:t>
+      </w:r>
+    </w:p>
+    <w:p>
+      <w:r>
+        <w:t>la API.</w:t>
       </w:r>
     </w:p>
     <w:p>
@@ -266,27 +321,39 @@
       <w:r>
         <w:rPr>
           <w:rFonts w:ascii="Consolas" w:hAnsi="Consolas"/>
+          <w:color w:val="C7254E"/>
           <w:sz w:val="19"/>
         </w:rPr>
         <w:t>api/fichada/*</w:t>
       </w:r>
       <w:r>
-        <w:t xml:space="preserve"> (consultar el historial) sí requieren</w:t>
+        <w:t xml:space="preserve"> (consultar el historial) sí usan JWT normal</w:t>
       </w:r>
     </w:p>
     <w:p>
       <w:r>
+        <w:t>(</w:t>
+      </w:r>
+      <w:r>
         <w:rPr>
           <w:rFonts w:ascii="Consolas" w:hAnsi="Consolas"/>
+          <w:color w:val="C7254E"/>
           <w:sz w:val="19"/>
         </w:rPr>
         <w:t>[Authorize]</w:t>
       </w:r>
       <w:r>
-        <w:t xml:space="preserve"> normal.</w:t>
+        <w:t>), porque esos los llama el front con un usuario logueado.</w:t>
       </w:r>
     </w:p>
-    <w:p/>
+    <w:p>
+      <w:pPr>
+        <w:spacing w:before="80" w:after="80"/>
+        <w:pBdr>
+          <w:bottom w:val="single" w:sz="6" w:space="1" w:color="AAAAAA"/>
+        </w:pBdr>
+      </w:pPr>
+    </w:p>
     <w:p>
       <w:pPr>
         <w:pStyle w:val="Heading2"/>
@@ -297,7 +364,7 @@
     </w:p>
     <w:tbl>
       <w:tblPr>
-        <w:tblStyle w:val="LightGrid-Accent1"/>
+        <w:tblStyle w:val="TableGrid"/>
         <w:tblW w:type="auto" w:w="0"/>
         <w:tblLook w:firstColumn="1" w:firstRow="1" w:lastColumn="0" w:lastRow="0" w:noHBand="0" w:noVBand="1" w:val="04A0"/>
       </w:tblPr>
@@ -375,6 +442,7 @@
             <w:r>
               <w:rPr>
                 <w:rFonts w:ascii="Consolas" w:hAnsi="Consolas"/>
+                <w:color w:val="C7254E"/>
                 <w:sz w:val="19"/>
               </w:rPr>
               <w:t>BiostarBaseUrl</w:t>
@@ -404,6 +472,7 @@
             <w:r>
               <w:rPr>
                 <w:rFonts w:ascii="Consolas" w:hAnsi="Consolas"/>
+                <w:color w:val="C7254E"/>
                 <w:sz w:val="19"/>
               </w:rPr>
               <w:t>https://IP:puerto</w:t>
@@ -424,6 +493,7 @@
             <w:r>
               <w:rPr>
                 <w:rFonts w:ascii="Consolas" w:hAnsi="Consolas"/>
+                <w:color w:val="C7254E"/>
                 <w:sz w:val="19"/>
               </w:rPr>
               <w:t>BiostarLoginPath</w:t>
@@ -453,6 +523,7 @@
             <w:r>
               <w:rPr>
                 <w:rFonts w:ascii="Consolas" w:hAnsi="Consolas"/>
+                <w:color w:val="C7254E"/>
                 <w:sz w:val="19"/>
               </w:rPr>
               <w:t>/api/login</w:t>
@@ -473,6 +544,7 @@
             <w:r>
               <w:rPr>
                 <w:rFonts w:ascii="Consolas" w:hAnsi="Consolas"/>
+                <w:color w:val="C7254E"/>
                 <w:sz w:val="19"/>
               </w:rPr>
               <w:t>BiostarEventsPath</w:t>
@@ -502,6 +574,7 @@
             <w:r>
               <w:rPr>
                 <w:rFonts w:ascii="Consolas" w:hAnsi="Consolas"/>
+                <w:color w:val="C7254E"/>
                 <w:sz w:val="19"/>
               </w:rPr>
               <w:t>/api/events/search</w:t>
@@ -522,6 +595,7 @@
             <w:r>
               <w:rPr>
                 <w:rFonts w:ascii="Consolas" w:hAnsi="Consolas"/>
+                <w:color w:val="C7254E"/>
                 <w:sz w:val="19"/>
               </w:rPr>
               <w:t>BiostarUser</w:t>
@@ -561,6 +635,7 @@
             <w:r>
               <w:rPr>
                 <w:rFonts w:ascii="Consolas" w:hAnsi="Consolas"/>
+                <w:color w:val="C7254E"/>
                 <w:sz w:val="19"/>
               </w:rPr>
               <w:t>BiostarPassword</w:t>
@@ -603,6 +678,61 @@
             <w:r>
               <w:rPr>
                 <w:rFonts w:ascii="Consolas" w:hAnsi="Consolas"/>
+                <w:color w:val="C7254E"/>
+                <w:sz w:val="19"/>
+              </w:rPr>
+              <w:t>BiostarSyncKey</w:t>
+            </w:r>
+          </w:p>
+        </w:tc>
+        <w:tc>
+          <w:tcPr>
+            <w:tcW w:type="dxa" w:w="2880"/>
+          </w:tcPr>
+          <w:p>
+            <w:r/>
+            <w:r>
+              <w:rPr>
+                <w:b/>
+              </w:rPr>
+              <w:t>appSettings.secrets.config</w:t>
+            </w:r>
+          </w:p>
+        </w:tc>
+        <w:tc>
+          <w:tcPr>
+            <w:tcW w:type="dxa" w:w="2880"/>
+          </w:tcPr>
+          <w:p>
+            <w:r/>
+            <w:r>
+              <w:t xml:space="preserve">Clave que debe mandar el tótem en </w:t>
+            </w:r>
+            <w:r>
+              <w:rPr>
+                <w:rFonts w:ascii="Consolas" w:hAnsi="Consolas"/>
+                <w:color w:val="C7254E"/>
+                <w:sz w:val="19"/>
+              </w:rPr>
+              <w:t>X-Biostar-Key</w:t>
+            </w:r>
+            <w:r>
+              <w:t xml:space="preserve"> (nunca en Web.config)</w:t>
+            </w:r>
+          </w:p>
+        </w:tc>
+      </w:tr>
+      <w:tr>
+        <w:tc>
+          <w:tcPr>
+            <w:tcW w:type="dxa" w:w="2880"/>
+          </w:tcPr>
+          <w:p>
+            <w:r/>
+            <w:r>
+              <w:rPr>
+                <w:rFonts w:ascii="Consolas" w:hAnsi="Consolas"/>
+                <w:color w:val="C7254E"/>
                 <w:sz w:val="19"/>
               </w:rPr>
               <w:t>BiostarDefaultMinutesBack</w:t>
@@ -642,6 +772,7 @@
             <w:r>
               <w:rPr>
                 <w:rFonts w:ascii="Consolas" w:hAnsi="Consolas"/>
+                <w:color w:val="C7254E"/>
                 <w:sz w:val="19"/>
               </w:rPr>
               <w:t>BiostarDefaultEventId</w:t>
@@ -671,6 +802,7 @@
             <w:r>
               <w:rPr>
                 <w:rFonts w:ascii="Consolas" w:hAnsi="Consolas"/>
+                <w:color w:val="C7254E"/>
                 <w:sz w:val="19"/>
               </w:rPr>
               <w:t>event_type_id.code</w:t>
@@ -691,6 +823,7 @@
             <w:r>
               <w:rPr>
                 <w:rFonts w:ascii="Consolas" w:hAnsi="Consolas"/>
+                <w:color w:val="C7254E"/>
                 <w:sz w:val="19"/>
               </w:rPr>
               <w:t>BiostarDefaultDeviceId</w:t>
@@ -720,6 +853,7 @@
             <w:r>
               <w:rPr>
                 <w:rFonts w:ascii="Consolas" w:hAnsi="Consolas"/>
+                <w:color w:val="C7254E"/>
                 <w:sz w:val="19"/>
               </w:rPr>
               <w:t>device_id.id</w:t>
@@ -731,7 +865,6 @@
         </w:tc>
       </w:tr>
     </w:tbl>
-    <w:p/>
     <w:p>
       <w:r>
         <w:t xml:space="preserve">Si falta cualquiera de </w:t>
@@ -739,6 +872,7 @@
       <w:r>
         <w:rPr>
           <w:rFonts w:ascii="Consolas" w:hAnsi="Consolas"/>
+          <w:color w:val="C7254E"/>
           <w:sz w:val="19"/>
         </w:rPr>
         <w:t>BiostarBaseUrl</w:t>
@@ -749,6 +883,7 @@
       <w:r>
         <w:rPr>
           <w:rFonts w:ascii="Consolas" w:hAnsi="Consolas"/>
+          <w:color w:val="C7254E"/>
           <w:sz w:val="19"/>
         </w:rPr>
         <w:t>BiostarUser</w:t>
@@ -759,6 +894,7 @@
       <w:r>
         <w:rPr>
           <w:rFonts w:ascii="Consolas" w:hAnsi="Consolas"/>
+          <w:color w:val="C7254E"/>
           <w:sz w:val="19"/>
         </w:rPr>
         <w:t>BiostarPassword</w:t>
@@ -771,6 +907,7 @@
       <w:r>
         <w:rPr>
           <w:rFonts w:ascii="Consolas" w:hAnsi="Consolas"/>
+          <w:color w:val="C7254E"/>
           <w:sz w:val="19"/>
         </w:rPr>
         <w:t>BiostarDefaultEventId</w:t>
@@ -781,6 +918,7 @@
       <w:r>
         <w:rPr>
           <w:rFonts w:ascii="Consolas" w:hAnsi="Consolas"/>
+          <w:color w:val="C7254E"/>
           <w:sz w:val="19"/>
         </w:rPr>
         <w:t>BiostarDefaultDeviceId</w:t>
@@ -791,10 +929,35 @@
     </w:p>
     <w:p>
       <w:r>
-        <w:t>al construir el controller (no arranca ese endpoint).</w:t>
+        <w:t>al construir el controller (no arranca ese endpoint). Si falta</w:t>
       </w:r>
     </w:p>
-    <w:p/>
+    <w:p>
+      <w:r>
+        <w:rPr>
+          <w:rFonts w:ascii="Consolas" w:hAnsi="Consolas"/>
+          <w:color w:val="C7254E"/>
+          <w:sz w:val="19"/>
+        </w:rPr>
+        <w:t>BiostarSyncKey</w:t>
+      </w:r>
+      <w:r>
+        <w:t xml:space="preserve"> (o queda vacío), el endpoint responde 401 a cualquier</w:t>
+      </w:r>
+    </w:p>
+    <w:p>
+      <w:r>
+        <w:t>llamada — falla cerrado, no abierto.</w:t>
+      </w:r>
+    </w:p>
+    <w:p>
+      <w:pPr>
+        <w:spacing w:before="80" w:after="80"/>
+        <w:pBdr>
+          <w:bottom w:val="single" w:sz="6" w:space="1" w:color="AAAAAA"/>
+        </w:pBdr>
+      </w:pPr>
+    </w:p>
     <w:p>
       <w:pPr>
         <w:pStyle w:val="Heading2"/>
@@ -813,7 +976,7 @@
     </w:p>
     <w:tbl>
       <w:tblPr>
-        <w:tblStyle w:val="LightGrid-Accent1"/>
+        <w:tblStyle w:val="TableGrid"/>
         <w:tblW w:type="auto" w:w="0"/>
         <w:tblLook w:firstColumn="1" w:firstRow="1" w:lastColumn="0" w:lastRow="0" w:noHBand="0" w:noVBand="1" w:val="04A0"/>
       </w:tblPr>
@@ -905,6 +1068,7 @@
             <w:r>
               <w:rPr>
                 <w:rFonts w:ascii="Consolas" w:hAnsi="Consolas"/>
+                <w:color w:val="C7254E"/>
                 <w:sz w:val="19"/>
               </w:rPr>
               <w:t>/api/biostar/events</w:t>
@@ -918,16 +1082,72 @@
           <w:p>
             <w:r/>
             <w:r>
-              <w:t>Ninguna (ver nota de seguridad arriba)</w:t>
+              <w:t xml:space="preserve">Header </w:t>
+            </w:r>
+            <w:r>
+              <w:rPr>
+                <w:rFonts w:ascii="Consolas" w:hAnsi="Consolas"/>
+                <w:color w:val="C7254E"/>
+                <w:sz w:val="19"/>
+              </w:rPr>
+              <w:t>X-Biostar-Key</w:t>
+            </w:r>
+            <w:r>
+              <w:t xml:space="preserve"> (ver sección 2)</w:t>
             </w:r>
           </w:p>
         </w:tc>
       </w:tr>
     </w:tbl>
-    <w:p/>
     <w:p>
       <w:r>
-        <w:t>No recibe body. Internamente:</w:t>
+        <w:t xml:space="preserve">No recibe body (pero sí requiere </w:t>
+      </w:r>
+      <w:r>
+        <w:rPr>
+          <w:rFonts w:ascii="Consolas" w:hAnsi="Consolas"/>
+          <w:color w:val="C7254E"/>
+          <w:sz w:val="19"/>
+        </w:rPr>
+        <w:t>Content-Length</w:t>
+      </w:r>
+      <w:r>
+        <w:t xml:space="preserve"> — si se prueba con curl,</w:t>
+      </w:r>
+    </w:p>
+    <w:p>
+      <w:r>
+        <w:t xml:space="preserve">mandar </w:t>
+      </w:r>
+      <w:r>
+        <w:rPr>
+          <w:rFonts w:ascii="Consolas" w:hAnsi="Consolas"/>
+          <w:color w:val="C7254E"/>
+          <w:sz w:val="19"/>
+        </w:rPr>
+        <w:t>-d ""</w:t>
+      </w:r>
+      <w:r>
+        <w:t xml:space="preserve"> para un body vacío en vez de omitirlo). Internamente:</w:t>
+      </w:r>
+    </w:p>
+    <w:p>
+      <w:pPr>
+        <w:pStyle w:val="ListNumber"/>
+      </w:pPr>
+      <w:r>
+        <w:t xml:space="preserve">Valida el header </w:t>
+      </w:r>
+      <w:r>
+        <w:rPr>
+          <w:rFonts w:ascii="Consolas" w:hAnsi="Consolas"/>
+          <w:color w:val="C7254E"/>
+          <w:sz w:val="19"/>
+        </w:rPr>
+        <w:t>X-Biostar-Key</w:t>
+      </w:r>
+      <w:r>
+        <w:t>.</w:t>
       </w:r>
     </w:p>
     <w:p>
@@ -953,6 +1173,7 @@
       <w:r>
         <w:rPr>
           <w:rFonts w:ascii="Consolas" w:hAnsi="Consolas"/>
+          <w:color w:val="C7254E"/>
           <w:sz w:val="19"/>
         </w:rPr>
         <w:t>device_id</w:t>
@@ -963,6 +1184,7 @@
       <w:r>
         <w:rPr>
           <w:rFonts w:ascii="Consolas" w:hAnsi="Consolas"/>
+          <w:color w:val="C7254E"/>
           <w:sz w:val="19"/>
         </w:rPr>
         <w:t>event_type_id.code</w:t>
@@ -975,6 +1197,7 @@
       <w:r>
         <w:rPr>
           <w:rFonts w:ascii="Consolas" w:hAnsi="Consolas"/>
+          <w:color w:val="C7254E"/>
           <w:sz w:val="19"/>
         </w:rPr>
         <w:t>ahora</w:t>
@@ -985,6 +1208,7 @@
       <w:r>
         <w:rPr>
           <w:rFonts w:ascii="Consolas" w:hAnsi="Consolas"/>
+          <w:color w:val="C7254E"/>
           <w:sz w:val="19"/>
         </w:rPr>
         <w:t>ahora + 1 día</w:t>
@@ -1020,6 +1244,7 @@
       <w:r>
         <w:rPr>
           <w:rFonts w:ascii="Consolas" w:hAnsi="Consolas"/>
+          <w:color w:val="C7254E"/>
           <w:sz w:val="19"/>
         </w:rPr>
         <w:t>RegistrarDesdeBiostarAsync</w:t>
@@ -1038,20 +1263,47 @@
     </w:p>
     <w:p>
       <w:pPr>
-        <w:spacing w:after="160"/>
-        <w:ind w:left="432"/>
+        <w:ind w:left="360"/>
       </w:pPr>
       <w:r>
         <w:rPr>
           <w:rFonts w:ascii="Consolas" w:hAnsi="Consolas"/>
-          <w:sz w:val="18"/>
+          <w:color w:val="333333"/>
+          <w:sz w:val="19"/>
         </w:rPr>
         <w:t>{</w:t>
+      </w:r>
+      <w:r>
         <w:br/>
+      </w:r>
+      <w:r>
+        <w:rPr>
+          <w:rFonts w:ascii="Consolas" w:hAnsi="Consolas"/>
+          <w:color w:val="333333"/>
+          <w:sz w:val="19"/>
+        </w:rPr>
         <w:t xml:space="preserve">  "tieneDatos": false,</w:t>
+      </w:r>
+      <w:r>
         <w:br/>
+      </w:r>
+      <w:r>
+        <w:rPr>
+          <w:rFonts w:ascii="Consolas" w:hAnsi="Consolas"/>
+          <w:color w:val="333333"/>
+          <w:sz w:val="19"/>
+        </w:rPr>
         <w:t xml:space="preserve">  "mensaje": "Biostar no devolvió eventos en el rango configurado."</w:t>
+      </w:r>
+      <w:r>
         <w:br/>
+      </w:r>
+      <w:r>
+        <w:rPr>
+          <w:rFonts w:ascii="Consolas" w:hAnsi="Consolas"/>
+          <w:color w:val="333333"/>
+          <w:sz w:val="19"/>
+        </w:rPr>
         <w:t>}</w:t>
       </w:r>
     </w:p>
@@ -1065,52 +1317,223 @@
     </w:p>
     <w:p>
       <w:pPr>
-        <w:spacing w:after="160"/>
-        <w:ind w:left="432"/>
+        <w:ind w:left="360"/>
       </w:pPr>
       <w:r>
         <w:rPr>
           <w:rFonts w:ascii="Consolas" w:hAnsi="Consolas"/>
-          <w:sz w:val="18"/>
+          <w:color w:val="333333"/>
+          <w:sz w:val="19"/>
         </w:rPr>
         <w:t>{</w:t>
+      </w:r>
+      <w:r>
         <w:br/>
+      </w:r>
+      <w:r>
+        <w:rPr>
+          <w:rFonts w:ascii="Consolas" w:hAnsi="Consolas"/>
+          <w:color w:val="333333"/>
+          <w:sz w:val="19"/>
+        </w:rPr>
         <w:t xml:space="preserve">  "tieneDatos": true,</w:t>
+      </w:r>
+      <w:r>
         <w:br/>
+      </w:r>
+      <w:r>
+        <w:rPr>
+          <w:rFonts w:ascii="Consolas" w:hAnsi="Consolas"/>
+          <w:color w:val="333333"/>
+          <w:sz w:val="19"/>
+        </w:rPr>
         <w:t xml:space="preserve">  "evento": {</w:t>
+      </w:r>
+      <w:r>
         <w:br/>
+      </w:r>
+      <w:r>
+        <w:rPr>
+          <w:rFonts w:ascii="Consolas" w:hAnsi="Consolas"/>
+          <w:color w:val="333333"/>
+          <w:sz w:val="19"/>
+        </w:rPr>
         <w:t xml:space="preserve">    "legajo": "1245",</w:t>
+      </w:r>
+      <w:r>
         <w:br/>
+      </w:r>
+      <w:r>
+        <w:rPr>
+          <w:rFonts w:ascii="Consolas" w:hAnsi="Consolas"/>
+          <w:color w:val="333333"/>
+          <w:sz w:val="19"/>
+        </w:rPr>
         <w:t xml:space="preserve">    "nombre": "Juan Pérez",</w:t>
+      </w:r>
+      <w:r>
         <w:br/>
+      </w:r>
+      <w:r>
+        <w:rPr>
+          <w:rFonts w:ascii="Consolas" w:hAnsi="Consolas"/>
+          <w:color w:val="333333"/>
+          <w:sz w:val="19"/>
+        </w:rPr>
         <w:t xml:space="preserve">    "planta": 1,</w:t>
+      </w:r>
+      <w:r>
         <w:br/>
+      </w:r>
+      <w:r>
+        <w:rPr>
+          <w:rFonts w:ascii="Consolas" w:hAnsi="Consolas"/>
+          <w:color w:val="333333"/>
+          <w:sz w:val="19"/>
+        </w:rPr>
         <w:t xml:space="preserve">    "centro_costo": 5,</w:t>
+      </w:r>
+      <w:r>
         <w:br/>
+      </w:r>
+      <w:r>
+        <w:rPr>
+          <w:rFonts w:ascii="Consolas" w:hAnsi="Consolas"/>
+          <w:color w:val="333333"/>
+          <w:sz w:val="19"/>
+        </w:rPr>
         <w:t xml:space="preserve">    "proyecto": 1,</w:t>
+      </w:r>
+      <w:r>
         <w:br/>
+      </w:r>
+      <w:r>
+        <w:rPr>
+          <w:rFonts w:ascii="Consolas" w:hAnsi="Consolas"/>
+          <w:color w:val="333333"/>
+          <w:sz w:val="19"/>
+        </w:rPr>
         <w:t xml:space="preserve">    "jerarquia": 3,</w:t>
+      </w:r>
+      <w:r>
         <w:br/>
+      </w:r>
+      <w:r>
+        <w:rPr>
+          <w:rFonts w:ascii="Consolas" w:hAnsi="Consolas"/>
+          <w:color w:val="333333"/>
+          <w:sz w:val="19"/>
+        </w:rPr>
         <w:t xml:space="preserve">    "bonificacion": 1,</w:t>
+      </w:r>
+      <w:r>
         <w:br/>
+      </w:r>
+      <w:r>
+        <w:rPr>
+          <w:rFonts w:ascii="Consolas" w:hAnsi="Consolas"/>
+          <w:color w:val="333333"/>
+          <w:sz w:val="19"/>
+        </w:rPr>
         <w:t xml:space="preserve">    "bonificacion_invitado": 0,</w:t>
+      </w:r>
+      <w:r>
         <w:br/>
+      </w:r>
+      <w:r>
+        <w:rPr>
+          <w:rFonts w:ascii="Consolas" w:hAnsi="Consolas"/>
+          <w:color w:val="333333"/>
+          <w:sz w:val="19"/>
+        </w:rPr>
         <w:t xml:space="preserve">    "fechaHoraUtc": "2026-08-07T13:05:00Z",</w:t>
+      </w:r>
+      <w:r>
         <w:br/>
+      </w:r>
+      <w:r>
+        <w:rPr>
+          <w:rFonts w:ascii="Consolas" w:hAnsi="Consolas"/>
+          <w:color w:val="333333"/>
+          <w:sz w:val="19"/>
+        </w:rPr>
         <w:t xml:space="preserve">    "deviceBiostarId": "865718937",</w:t>
+      </w:r>
+      <w:r>
         <w:br/>
+      </w:r>
+      <w:r>
+        <w:rPr>
+          <w:rFonts w:ascii="Consolas" w:hAnsi="Consolas"/>
+          <w:color w:val="333333"/>
+          <w:sz w:val="19"/>
+        </w:rPr>
         <w:t xml:space="preserve">    "deviceBiostarName": "Molinete Entrada",</w:t>
+      </w:r>
+      <w:r>
         <w:br/>
+      </w:r>
+      <w:r>
+        <w:rPr>
+          <w:rFonts w:ascii="Consolas" w:hAnsi="Consolas"/>
+          <w:color w:val="333333"/>
+          <w:sz w:val="19"/>
+        </w:rPr>
         <w:t xml:space="preserve">    "eventCode": "4118",</w:t>
+      </w:r>
+      <w:r>
         <w:br/>
+      </w:r>
+      <w:r>
+        <w:rPr>
+          <w:rFonts w:ascii="Consolas" w:hAnsi="Consolas"/>
+          <w:color w:val="333333"/>
+          <w:sz w:val="19"/>
+        </w:rPr>
         <w:t xml:space="preserve">    "rawId": "abc123",</w:t>
+      </w:r>
+      <w:r>
         <w:br/>
+      </w:r>
+      <w:r>
+        <w:rPr>
+          <w:rFonts w:ascii="Consolas" w:hAnsi="Consolas"/>
+          <w:color w:val="333333"/>
+          <w:sz w:val="19"/>
+        </w:rPr>
         <w:t xml:space="preserve">    "rawIndex": "1"</w:t>
+      </w:r>
+      <w:r>
         <w:br/>
+      </w:r>
+      <w:r>
+        <w:rPr>
+          <w:rFonts w:ascii="Consolas" w:hAnsi="Consolas"/>
+          <w:color w:val="333333"/>
+          <w:sz w:val="19"/>
+        </w:rPr>
         <w:t xml:space="preserve">  },</w:t>
+      </w:r>
+      <w:r>
         <w:br/>
+      </w:r>
+      <w:r>
+        <w:rPr>
+          <w:rFonts w:ascii="Consolas" w:hAnsi="Consolas"/>
+          <w:color w:val="333333"/>
+          <w:sz w:val="19"/>
+        </w:rPr>
         <w:t xml:space="preserve">  "fichadaId": 42</w:t>
+      </w:r>
+      <w:r>
         <w:br/>
+      </w:r>
+      <w:r>
+        <w:rPr>
+          <w:rFonts w:ascii="Consolas" w:hAnsi="Consolas"/>
+          <w:color w:val="333333"/>
+          <w:sz w:val="19"/>
+        </w:rPr>
         <w:t>}</w:t>
       </w:r>
     </w:p>
@@ -1124,24 +1547,69 @@
     </w:p>
     <w:p>
       <w:pPr>
-        <w:spacing w:after="160"/>
-        <w:ind w:left="432"/>
+        <w:ind w:left="360"/>
       </w:pPr>
       <w:r>
         <w:rPr>
           <w:rFonts w:ascii="Consolas" w:hAnsi="Consolas"/>
-          <w:sz w:val="18"/>
+          <w:color w:val="333333"/>
+          <w:sz w:val="19"/>
         </w:rPr>
         <w:t>{</w:t>
+      </w:r>
+      <w:r>
         <w:br/>
+      </w:r>
+      <w:r>
+        <w:rPr>
+          <w:rFonts w:ascii="Consolas" w:hAnsi="Consolas"/>
+          <w:color w:val="333333"/>
+          <w:sz w:val="19"/>
+        </w:rPr>
         <w:t xml:space="preserve">  "tieneDatos": true,</w:t>
+      </w:r>
+      <w:r>
         <w:br/>
+      </w:r>
+      <w:r>
+        <w:rPr>
+          <w:rFonts w:ascii="Consolas" w:hAnsi="Consolas"/>
+          <w:color w:val="333333"/>
+          <w:sz w:val="19"/>
+        </w:rPr>
         <w:t xml:space="preserve">  "fichadaDuplicada": true,</w:t>
+      </w:r>
+      <w:r>
         <w:br/>
+      </w:r>
+      <w:r>
+        <w:rPr>
+          <w:rFonts w:ascii="Consolas" w:hAnsi="Consolas"/>
+          <w:color w:val="333333"/>
+          <w:sz w:val="19"/>
+        </w:rPr>
         <w:t xml:space="preserve">  "mensaje": "La fichada ya fue registrada anteriormente (Legajo: 1245, EventId: 987654).",</w:t>
+      </w:r>
+      <w:r>
         <w:br/>
+      </w:r>
+      <w:r>
+        <w:rPr>
+          <w:rFonts w:ascii="Consolas" w:hAnsi="Consolas"/>
+          <w:color w:val="333333"/>
+          <w:sz w:val="19"/>
+        </w:rPr>
         <w:t xml:space="preserve">  "evento": { "legajo": "1245", "nombre": "Juan Pérez", "rawId": "987654", "fechaHoraUtc": "..." }</w:t>
+      </w:r>
+      <w:r>
         <w:br/>
+      </w:r>
+      <w:r>
+        <w:rPr>
+          <w:rFonts w:ascii="Consolas" w:hAnsi="Consolas"/>
+          <w:color w:val="333333"/>
+          <w:sz w:val="19"/>
+        </w:rPr>
         <w:t>}</w:t>
       </w:r>
     </w:p>
@@ -1180,6 +1648,47 @@
         <w:rPr>
           <w:b/>
         </w:rPr>
+        <w:t>401 Unauthorized</w:t>
+      </w:r>
+      <w:r>
+        <w:t xml:space="preserve"> — falta el header </w:t>
+      </w:r>
+      <w:r>
+        <w:rPr>
+          <w:rFonts w:ascii="Consolas" w:hAnsi="Consolas"/>
+          <w:color w:val="C7254E"/>
+          <w:sz w:val="19"/>
+        </w:rPr>
+        <w:t>X-Biostar-Key</w:t>
+      </w:r>
+      <w:r>
+        <w:t>, la clave no</w:t>
+      </w:r>
+    </w:p>
+    <w:p>
+      <w:r>
+        <w:t xml:space="preserve">coincide, o no hay </w:t>
+      </w:r>
+      <w:r>
+        <w:rPr>
+          <w:rFonts w:ascii="Consolas" w:hAnsi="Consolas"/>
+          <w:color w:val="C7254E"/>
+          <w:sz w:val="19"/>
+        </w:rPr>
+        <w:t>BiostarSyncKey</w:t>
+      </w:r>
+      <w:r>
+        <w:t xml:space="preserve"> configurado en el servidor.</w:t>
+      </w:r>
+    </w:p>
+    <w:p>
+      <w:pPr>
+        <w:pStyle w:val="ListBullet"/>
+      </w:pPr>
+      <w:r>
+        <w:rPr>
+          <w:b/>
+        </w:rPr>
         <w:t>400 Bad Request</w:t>
       </w:r>
       <w:r>
@@ -1193,6 +1702,7 @@
       <w:r>
         <w:rPr>
           <w:rFonts w:ascii="Consolas" w:hAnsi="Consolas"/>
+          <w:color w:val="C7254E"/>
           <w:sz w:val="19"/>
         </w:rPr>
         <w:t>code</w:t>
@@ -1203,6 +1713,7 @@
       <w:r>
         <w:rPr>
           <w:rFonts w:ascii="Consolas" w:hAnsi="Consolas"/>
+          <w:color w:val="C7254E"/>
           <w:sz w:val="19"/>
         </w:rPr>
         <w:t>"0"</w:t>
@@ -1213,6 +1724,7 @@
       <w:r>
         <w:rPr>
           <w:rFonts w:ascii="Consolas" w:hAnsi="Consolas"/>
+          <w:color w:val="C7254E"/>
           <w:sz w:val="19"/>
         </w:rPr>
         <w:t>code</w:t>
@@ -1223,6 +1735,7 @@
       <w:r>
         <w:rPr>
           <w:rFonts w:ascii="Consolas" w:hAnsi="Consolas"/>
+          <w:color w:val="C7254E"/>
           <w:sz w:val="19"/>
         </w:rPr>
         <w:t>detail</w:t>
@@ -1263,6 +1776,7 @@
       <w:r>
         <w:rPr>
           <w:rFonts w:ascii="Consolas" w:hAnsi="Consolas"/>
+          <w:color w:val="C7254E"/>
           <w:sz w:val="19"/>
         </w:rPr>
         <w:t>Plan_nutricional</w:t>
@@ -1271,7 +1785,14 @@
         <w:t xml:space="preserve"> inválido) u otro error no controlado.</w:t>
       </w:r>
     </w:p>
-    <w:p/>
+    <w:p>
+      <w:pPr>
+        <w:spacing w:before="80" w:after="80"/>
+        <w:pBdr>
+          <w:bottom w:val="single" w:sz="6" w:space="1" w:color="AAAAAA"/>
+        </w:pBdr>
+      </w:pPr>
+    </w:p>
     <w:p>
       <w:pPr>
         <w:pStyle w:val="Heading3"/>
@@ -1282,7 +1803,7 @@
     </w:p>
     <w:tbl>
       <w:tblPr>
-        <w:tblStyle w:val="LightGrid-Accent1"/>
+        <w:tblStyle w:val="TableGrid"/>
         <w:tblW w:type="auto" w:w="0"/>
         <w:tblLook w:firstColumn="1" w:firstRow="1" w:lastColumn="0" w:lastRow="0" w:noHBand="0" w:noVBand="1" w:val="04A0"/>
       </w:tblPr>
@@ -1374,6 +1895,7 @@
             <w:r>
               <w:rPr>
                 <w:rFonts w:ascii="Consolas" w:hAnsi="Consolas"/>
+                <w:color w:val="C7254E"/>
                 <w:sz w:val="19"/>
               </w:rPr>
               <w:t>/api/fichada/lista</w:t>
@@ -1393,7 +1915,6 @@
         </w:tc>
       </w:tr>
     </w:tbl>
-    <w:p/>
     <w:p>
       <w:r>
         <w:rPr>
@@ -1404,7 +1925,7 @@
     </w:p>
     <w:tbl>
       <w:tblPr>
-        <w:tblStyle w:val="LightGrid-Accent1"/>
+        <w:tblStyle w:val="TableGrid"/>
         <w:tblW w:type="auto" w:w="0"/>
         <w:tblLook w:firstColumn="1" w:firstRow="1" w:lastColumn="0" w:lastRow="0" w:noHBand="0" w:noVBand="1" w:val="04A0"/>
       </w:tblPr>
@@ -1502,6 +2023,7 @@
             <w:r>
               <w:rPr>
                 <w:rFonts w:ascii="Consolas" w:hAnsi="Consolas"/>
+                <w:color w:val="C7254E"/>
                 <w:sz w:val="19"/>
               </w:rPr>
               <w:t>page</w:t>
@@ -1552,6 +2074,7 @@
             <w:r>
               <w:rPr>
                 <w:rFonts w:ascii="Consolas" w:hAnsi="Consolas"/>
+                <w:color w:val="C7254E"/>
                 <w:sz w:val="19"/>
               </w:rPr>
               <w:t>pageSize</w:t>
@@ -1602,6 +2125,7 @@
             <w:r>
               <w:rPr>
                 <w:rFonts w:ascii="Consolas" w:hAnsi="Consolas"/>
+                <w:color w:val="C7254E"/>
                 <w:sz w:val="19"/>
               </w:rPr>
               <w:t>fechaDesde</w:t>
@@ -1652,6 +2176,7 @@
             <w:r>
               <w:rPr>
                 <w:rFonts w:ascii="Consolas" w:hAnsi="Consolas"/>
+                <w:color w:val="C7254E"/>
                 <w:sz w:val="19"/>
               </w:rPr>
               <w:t>fechaHasta</w:t>
@@ -1702,6 +2227,7 @@
             <w:r>
               <w:rPr>
                 <w:rFonts w:ascii="Consolas" w:hAnsi="Consolas"/>
+                <w:color w:val="C7254E"/>
                 <w:sz w:val="19"/>
               </w:rPr>
               <w:t>identificadorUsuario</w:t>
@@ -1752,6 +2278,7 @@
             <w:r>
               <w:rPr>
                 <w:rFonts w:ascii="Consolas" w:hAnsi="Consolas"/>
+                <w:color w:val="C7254E"/>
                 <w:sz w:val="19"/>
               </w:rPr>
               <w:t>turnoId</w:t>
@@ -1802,6 +2329,7 @@
             <w:r>
               <w:rPr>
                 <w:rFonts w:ascii="Consolas" w:hAnsi="Consolas"/>
+                <w:color w:val="C7254E"/>
                 <w:sz w:val="19"/>
               </w:rPr>
               <w:t>idDispositivo</w:t>
@@ -1843,7 +2371,6 @@
         </w:tc>
       </w:tr>
     </w:tbl>
-    <w:p/>
     <w:p>
       <w:r>
         <w:t>Devuelve un resultado paginado (</w:t>
@@ -1851,6 +2378,7 @@
       <w:r>
         <w:rPr>
           <w:rFonts w:ascii="Consolas" w:hAnsi="Consolas"/>
+          <w:color w:val="C7254E"/>
           <w:sz w:val="19"/>
         </w:rPr>
         <w:t>page</w:t>
@@ -1861,6 +2389,7 @@
       <w:r>
         <w:rPr>
           <w:rFonts w:ascii="Consolas" w:hAnsi="Consolas"/>
+          <w:color w:val="C7254E"/>
           <w:sz w:val="19"/>
         </w:rPr>
         <w:t>pageSize</w:t>
@@ -1871,6 +2400,7 @@
       <w:r>
         <w:rPr>
           <w:rFonts w:ascii="Consolas" w:hAnsi="Consolas"/>
+          <w:color w:val="C7254E"/>
           <w:sz w:val="19"/>
         </w:rPr>
         <w:t>totalItems</w:t>
@@ -1881,6 +2411,7 @@
       <w:r>
         <w:rPr>
           <w:rFonts w:ascii="Consolas" w:hAnsi="Consolas"/>
+          <w:color w:val="C7254E"/>
           <w:sz w:val="19"/>
         </w:rPr>
         <w:t>items</w:t>
@@ -1896,6 +2427,7 @@
       <w:r>
         <w:rPr>
           <w:rFonts w:ascii="Consolas" w:hAnsi="Consolas"/>
+          <w:color w:val="C7254E"/>
           <w:sz w:val="19"/>
         </w:rPr>
         <w:t>Id</w:t>
@@ -1906,6 +2438,7 @@
       <w:r>
         <w:rPr>
           <w:rFonts w:ascii="Consolas" w:hAnsi="Consolas"/>
+          <w:color w:val="C7254E"/>
           <w:sz w:val="19"/>
         </w:rPr>
         <w:t>IdentificadorUsuario</w:t>
@@ -1916,6 +2449,7 @@
       <w:r>
         <w:rPr>
           <w:rFonts w:ascii="Consolas" w:hAnsi="Consolas"/>
+          <w:color w:val="C7254E"/>
           <w:sz w:val="19"/>
         </w:rPr>
         <w:t>TurnoId</w:t>
@@ -1926,6 +2460,7 @@
       <w:r>
         <w:rPr>
           <w:rFonts w:ascii="Consolas" w:hAnsi="Consolas"/>
+          <w:color w:val="C7254E"/>
           <w:sz w:val="19"/>
         </w:rPr>
         <w:t>FechaFichada</w:t>
@@ -1936,6 +2471,7 @@
       <w:r>
         <w:rPr>
           <w:rFonts w:ascii="Consolas" w:hAnsi="Consolas"/>
+          <w:color w:val="C7254E"/>
           <w:sz w:val="19"/>
         </w:rPr>
         <w:t>IdDispositivo</w:t>
@@ -1948,6 +2484,7 @@
       <w:r>
         <w:rPr>
           <w:rFonts w:ascii="Consolas" w:hAnsi="Consolas"/>
+          <w:color w:val="C7254E"/>
           <w:sz w:val="19"/>
         </w:rPr>
         <w:t>Createdate</w:t>
@@ -1966,7 +2503,7 @@
     </w:p>
     <w:tbl>
       <w:tblPr>
-        <w:tblStyle w:val="LightGrid-Accent1"/>
+        <w:tblStyle w:val="TableGrid"/>
         <w:tblW w:type="auto" w:w="0"/>
         <w:tblLook w:firstColumn="1" w:firstRow="1" w:lastColumn="0" w:lastRow="0" w:noHBand="0" w:noVBand="1" w:val="04A0"/>
       </w:tblPr>
@@ -2058,6 +2595,7 @@
             <w:r>
               <w:rPr>
                 <w:rFonts w:ascii="Consolas" w:hAnsi="Consolas"/>
+                <w:color w:val="C7254E"/>
                 <w:sz w:val="19"/>
               </w:rPr>
               <w:t>/api/fichada/{id}</w:t>
@@ -2077,7 +2615,6 @@
         </w:tc>
       </w:tr>
     </w:tbl>
-    <w:p/>
     <w:p>
       <w:r>
         <w:rPr>
@@ -2099,7 +2636,7 @@
     </w:p>
     <w:tbl>
       <w:tblPr>
-        <w:tblStyle w:val="LightGrid-Accent1"/>
+        <w:tblStyle w:val="TableGrid"/>
         <w:tblW w:type="auto" w:w="0"/>
         <w:tblLook w:firstColumn="1" w:firstRow="1" w:lastColumn="0" w:lastRow="0" w:noHBand="0" w:noVBand="1" w:val="04A0"/>
       </w:tblPr>
@@ -2191,6 +2728,7 @@
             <w:r>
               <w:rPr>
                 <w:rFonts w:ascii="Consolas" w:hAnsi="Consolas"/>
+                <w:color w:val="C7254E"/>
                 <w:sz w:val="19"/>
               </w:rPr>
               <w:t>/api/fichada/crear</w:t>
@@ -2210,7 +2748,6 @@
         </w:tc>
       </w:tr>
     </w:tbl>
-    <w:p/>
     <w:p>
       <w:r>
         <w:t>Pensado para casos excepcionales (el molinete no registró algo y hay que</w:t>
@@ -2231,7 +2768,7 @@
     </w:p>
     <w:tbl>
       <w:tblPr>
-        <w:tblStyle w:val="LightGrid-Accent1"/>
+        <w:tblStyle w:val="TableGrid"/>
         <w:tblW w:type="auto" w:w="0"/>
         <w:tblLook w:firstColumn="1" w:firstRow="1" w:lastColumn="0" w:lastRow="0" w:noHBand="0" w:noVBand="1" w:val="04A0"/>
       </w:tblPr>
@@ -2329,6 +2866,7 @@
             <w:r>
               <w:rPr>
                 <w:rFonts w:ascii="Consolas" w:hAnsi="Consolas"/>
+                <w:color w:val="C7254E"/>
                 <w:sz w:val="19"/>
               </w:rPr>
               <w:t>IdentificadorUsuario</w:t>
@@ -2379,6 +2917,7 @@
             <w:r>
               <w:rPr>
                 <w:rFonts w:ascii="Consolas" w:hAnsi="Consolas"/>
+                <w:color w:val="C7254E"/>
                 <w:sz w:val="19"/>
               </w:rPr>
               <w:t>TurnoId</w:t>
@@ -2429,6 +2968,7 @@
             <w:r>
               <w:rPr>
                 <w:rFonts w:ascii="Consolas" w:hAnsi="Consolas"/>
+                <w:color w:val="C7254E"/>
                 <w:sz w:val="19"/>
               </w:rPr>
               <w:t>FechaFichada</w:t>
@@ -2479,6 +3019,7 @@
             <w:r>
               <w:rPr>
                 <w:rFonts w:ascii="Consolas" w:hAnsi="Consolas"/>
+                <w:color w:val="C7254E"/>
                 <w:sz w:val="19"/>
               </w:rPr>
               <w:t>IdDispositivo</w:t>
@@ -2520,7 +3061,6 @@
         </w:tc>
       </w:tr>
     </w:tbl>
-    <w:p/>
     <w:p>
       <w:r>
         <w:rPr>
@@ -2532,7 +3072,14 @@
         <w:t xml:space="preserve"> el detalle de la fichada creada.</w:t>
       </w:r>
     </w:p>
-    <w:p/>
+    <w:p>
+      <w:pPr>
+        <w:spacing w:before="80" w:after="80"/>
+        <w:pBdr>
+          <w:bottom w:val="single" w:sz="6" w:space="1" w:color="AAAAAA"/>
+        </w:pBdr>
+      </w:pPr>
+    </w:p>
     <w:p>
       <w:pPr>
         <w:pStyle w:val="Heading2"/>
@@ -2562,6 +3109,7 @@
       <w:r>
         <w:rPr>
           <w:rFonts w:ascii="Consolas" w:hAnsi="Consolas"/>
+          <w:color w:val="C7254E"/>
           <w:sz w:val="19"/>
         </w:rPr>
         <w:t>RegistrarDesdeBiostarAsync</w:t>
@@ -2586,6 +3134,7 @@
       <w:r>
         <w:rPr>
           <w:rFonts w:ascii="Consolas" w:hAnsi="Consolas"/>
+          <w:color w:val="C7254E"/>
           <w:sz w:val="19"/>
         </w:rPr>
         <w:t>smarTime = true</w:t>
@@ -2645,6 +3194,7 @@
       <w:r>
         <w:rPr>
           <w:rFonts w:ascii="Consolas" w:hAnsi="Consolas"/>
+          <w:color w:val="C7254E"/>
           <w:sz w:val="19"/>
         </w:rPr>
         <w:t>is_default</w:t>
@@ -2665,6 +3215,7 @@
       <w:r>
         <w:rPr>
           <w:rFonts w:ascii="Consolas" w:hAnsi="Consolas"/>
+          <w:color w:val="C7254E"/>
           <w:sz w:val="19"/>
         </w:rPr>
         <w:t>debe_cambiar_clave = true</w:t>
@@ -2685,6 +3236,7 @@
       <w:r>
         <w:rPr>
           <w:rFonts w:ascii="Consolas" w:hAnsi="Consolas"/>
+          <w:color w:val="C7254E"/>
           <w:sz w:val="19"/>
         </w:rPr>
         <w:t>fecha_fichada</w:t>
@@ -2693,7 +3245,14 @@
         <w:t>.</w:t>
       </w:r>
     </w:p>
-    <w:p/>
+    <w:p>
+      <w:pPr>
+        <w:spacing w:before="80" w:after="80"/>
+        <w:pBdr>
+          <w:bottom w:val="single" w:sz="6" w:space="1" w:color="AAAAAA"/>
+        </w:pBdr>
+      </w:pPr>
+    </w:p>
     <w:p>
       <w:pPr>
         <w:pStyle w:val="Heading2"/>
@@ -2704,7 +3263,7 @@
     </w:p>
     <w:tbl>
       <w:tblPr>
-        <w:tblStyle w:val="LightGrid-Accent1"/>
+        <w:tblStyle w:val="TableGrid"/>
         <w:tblW w:type="auto" w:w="0"/>
         <w:tblLook w:firstColumn="1" w:firstRow="1" w:lastColumn="0" w:lastRow="0" w:noHBand="0" w:noVBand="1" w:val="04A0"/>
       </w:tblPr>
@@ -2782,6 +3341,7 @@
             <w:r>
               <w:rPr>
                 <w:rFonts w:ascii="Consolas" w:hAnsi="Consolas"/>
+                <w:color w:val="C7254E"/>
                 <w:sz w:val="19"/>
               </w:rPr>
               <w:t>/api/biostar/events</w:t>
@@ -2806,13 +3366,18 @@
           <w:p>
             <w:r/>
             <w:r>
-              <w:rPr>
-                <w:b/>
-              </w:rPr>
-              <w:t>Ninguna</w:t>
+              <w:t xml:space="preserve">Header </w:t>
             </w:r>
             <w:r>
-              <w:t xml:space="preserve"> — ver nota de seguridad (sección 2)</w:t>
+              <w:rPr>
+                <w:rFonts w:ascii="Consolas" w:hAnsi="Consolas"/>
+                <w:color w:val="C7254E"/>
+                <w:sz w:val="19"/>
+              </w:rPr>
+              <w:t>X-Biostar-Key</w:t>
+            </w:r>
+            <w:r>
+              <w:t xml:space="preserve"> (clave compartida, no JWT)</w:t>
             </w:r>
           </w:p>
         </w:tc>
@@ -2827,6 +3392,7 @@
             <w:r>
               <w:rPr>
                 <w:rFonts w:ascii="Consolas" w:hAnsi="Consolas"/>
+                <w:color w:val="C7254E"/>
                 <w:sz w:val="19"/>
               </w:rPr>
               <w:t>/api/fichada/lista</w:t>
@@ -2866,6 +3432,7 @@
             <w:r>
               <w:rPr>
                 <w:rFonts w:ascii="Consolas" w:hAnsi="Consolas"/>
+                <w:color w:val="C7254E"/>
                 <w:sz w:val="19"/>
               </w:rPr>
               <w:t>/api/fichada/{id}</w:t>
@@ -2905,6 +3472,7 @@
             <w:r>
               <w:rPr>
                 <w:rFonts w:ascii="Consolas" w:hAnsi="Consolas"/>
+                <w:color w:val="C7254E"/>
                 <w:sz w:val="19"/>
               </w:rPr>
               <w:t>/api/fichada/crear</w:t>
@@ -2935,8 +3503,14 @@
         </w:tc>
       </w:tr>
     </w:tbl>
-    <w:p/>
-    <w:p/>
+    <w:p>
+      <w:pPr>
+        <w:spacing w:before="80" w:after="80"/>
+        <w:pBdr>
+          <w:bottom w:val="single" w:sz="6" w:space="1" w:color="AAAAAA"/>
+        </w:pBdr>
+      </w:pPr>
+    </w:p>
     <w:p>
       <w:r>
         <w:rPr>
@@ -3320,7 +3894,7 @@
     <w:rsid w:val="00FC693F"/>
     <w:rPr>
       <w:rFonts w:ascii="Calibri" w:hAnsi="Calibri"/>
-      <w:sz w:val="21"/>
+      <w:sz w:val="22"/>
     </w:rPr>
   </w:style>
   <w:style w:type="paragraph" w:styleId="Header">

</xml_diff>